<commit_message>
fix: readable title, transparent terms, real photos on white
Approved layout tweaks to the new proposal template and the photo pipeline:

- the proposal number and date jump from ~14pt to 20pt bold, so they read
  at a glance in the header.
- the offer-terms cells lose their solid white fill; the page background
  now shows through, as requested.
- product photos flatten onto white before JPEG. Transparent PNGs were
  turning black in JPEG — now they match the catalogue's white ground.
- a fetched "image" that is not actually an image (a dead or non-public
  Drive link returns an HTML page) is rejected by content-type, so the
  cell stays empty instead of showing a broken-image triangle.

The table position is left untouched: lifting it collided with the
"Корпорация Midea" background page.

Co-Authored-By: Claude Opus 5 <noreply@anthropic.com>
</commit_message>
<xml_diff>
--- a/templates/kp-new.docx
+++ b/templates/kp-new.docx
@@ -65,6 +65,8 @@
                                 <w:b/>
                                 <w:bCs/>
                                 <w:color w:val="269BD9"/>
+                                <w:sz w:val="40"/>
+                                <w:szCs w:val="40"/>
                               </w:rPr>
                               <w:t>№ {cp_number}</w:t>
                             </w:r>
@@ -74,6 +76,8 @@
                                 <w:b/>
                                 <w:bCs/>
                                 <w:color w:val="269BD9"/>
+                                <w:sz w:val="40"/>
+                                <w:szCs w:val="40"/>
                               </w:rPr>
                               <w:br/>
                               <w:t>Дата: {cp_date}</w:t>
@@ -118,6 +122,8 @@
                           <w:b/>
                           <w:bCs/>
                           <w:color w:val="269BD9"/>
+                          <w:sz w:val="40"/>
+                          <w:szCs w:val="40"/>
                         </w:rPr>
                         <w:t>№ {cp_number}</w:t>
                       </w:r>
@@ -127,6 +133,8 @@
                           <w:b/>
                           <w:bCs/>
                           <w:color w:val="269BD9"/>
+                          <w:sz w:val="40"/>
+                          <w:szCs w:val="40"/>
                         </w:rPr>
                         <w:br/>
                         <w:t>Дата: {cp_date}</w:t>
@@ -1361,7 +1369,7 @@
           <w:insideH w:val="single" w:sz="6" w:space="0" w:color="FFFFFF" w:themeColor="background1"/>
           <w:insideV w:val="single" w:sz="6" w:space="0" w:color="FFFFFF" w:themeColor="background1"/>
         </w:tblBorders>
-        <w:shd w:val="clear" w:color="auto" w:fill="FFFFFF" w:themeFill="background1"/>
+        <w:shd w:val="clear" w:color="auto" w:fill="auto" w:themeFill="background1"/>
         <w:tblLook w:val="04A0" w:firstRow="1" w:lastRow="0" w:firstColumn="1" w:lastColumn="0" w:noHBand="0" w:noVBand="1"/>
       </w:tblPr>
       <w:tblGrid>
@@ -1375,7 +1383,7 @@
         <w:tc>
           <w:tcPr>
             <w:tcW w:w="2878" w:type="dxa"/>
-            <w:shd w:val="clear" w:color="auto" w:fill="FFFFFF" w:themeFill="background1"/>
+            <w:shd w:val="clear" w:color="auto" w:fill="auto" w:themeFill="background1"/>
             <w:vAlign w:val="center"/>
           </w:tcPr>
           <w:p>
@@ -1406,7 +1414,7 @@
         <w:tc>
           <w:tcPr>
             <w:tcW w:w="7329" w:type="dxa"/>
-            <w:shd w:val="clear" w:color="auto" w:fill="FFFFFF" w:themeFill="background1"/>
+            <w:shd w:val="clear" w:color="auto" w:fill="auto" w:themeFill="background1"/>
             <w:vAlign w:val="center"/>
           </w:tcPr>
           <w:p>

</xml_diff>